<commit_message>
working on new release: - checked soildepth calculation - bugfix for ldd.nc (model was sometimes not working when using a ldd.nc instead of ldd.map) - new wetlands routine in reaservoirs - metaxml now always read in from model folder cwatm - pytest checke4d and added some tests
</commit_message>
<xml_diff>
--- a/Toolkit/pytesting/Pytest with CWATM.docx
+++ b/Toolkit/pytesting/Pytest with CWATM.docx
@@ -1,6 +1,6 @@
 
 <file path=word/document.xml><?xml version="1.0" encoding="utf-8"?>
-<w:document xmlns:wpc="http://schemas.microsoft.com/office/word/2010/wordprocessingCanvas" xmlns:cx="http://schemas.microsoft.com/office/drawing/2014/chartex" xmlns:cx1="http://schemas.microsoft.com/office/drawing/2015/9/8/chartex" xmlns:cx2="http://schemas.microsoft.com/office/drawing/2015/10/21/chartex" xmlns:cx3="http://schemas.microsoft.com/office/drawing/2016/5/9/chartex" xmlns:cx4="http://schemas.microsoft.com/office/drawing/2016/5/10/chartex" xmlns:cx5="http://schemas.microsoft.com/office/drawing/2016/5/11/chartex" xmlns:cx6="http://schemas.microsoft.com/office/drawing/2016/5/12/chartex" xmlns:cx7="http://schemas.microsoft.com/office/drawing/2016/5/13/chartex" xmlns:cx8="http://schemas.microsoft.com/office/drawing/2016/5/14/chartex" xmlns:mc="http://schemas.openxmlformats.org/markup-compatibility/2006" xmlns:aink="http://schemas.microsoft.com/office/drawing/2016/ink" xmlns:am3d="http://schemas.microsoft.com/office/drawing/2017/model3d" xmlns:o="urn:schemas-microsoft-com:office:office" xmlns:r="http://schemas.openxmlformats.org/officeDocument/2006/relationships" xmlns:m="http://schemas.openxmlformats.org/officeDocument/2006/math" xmlns:v="urn:schemas-microsoft-com:vml" xmlns:wp14="http://schemas.microsoft.com/office/word/2010/wordprocessingDrawing" xmlns:wp="http://schemas.openxmlformats.org/drawingml/2006/wordprocessingDrawing" xmlns:w10="urn:schemas-microsoft-com:office:word" xmlns:w="http://schemas.openxmlformats.org/wordprocessingml/2006/main" xmlns:w14="http://schemas.microsoft.com/office/word/2010/wordml" xmlns:w15="http://schemas.microsoft.com/office/word/2012/wordml" xmlns:w16cex="http://schemas.microsoft.com/office/word/2018/wordml/cex" xmlns:w16cid="http://schemas.microsoft.com/office/word/2016/wordml/cid" xmlns:w16="http://schemas.microsoft.com/office/word/2018/wordml" xmlns:w16sdtdh="http://schemas.microsoft.com/office/word/2020/wordml/sdtdatahash" xmlns:w16se="http://schemas.microsoft.com/office/word/2015/wordml/symex" xmlns:wpg="http://schemas.microsoft.com/office/word/2010/wordprocessingGroup" xmlns:wpi="http://schemas.microsoft.com/office/word/2010/wordprocessingInk" xmlns:wne="http://schemas.microsoft.com/office/word/2006/wordml" xmlns:wps="http://schemas.microsoft.com/office/word/2010/wordprocessingShape" mc:Ignorable="w14 w15 w16se w16cid w16 w16cex w16sdtdh wp14">
+<w:document xmlns:wpc="http://schemas.microsoft.com/office/word/2010/wordprocessingCanvas" xmlns:cx="http://schemas.microsoft.com/office/drawing/2014/chartex" xmlns:cx1="http://schemas.microsoft.com/office/drawing/2015/9/8/chartex" xmlns:cx2="http://schemas.microsoft.com/office/drawing/2015/10/21/chartex" xmlns:cx3="http://schemas.microsoft.com/office/drawing/2016/5/9/chartex" xmlns:cx4="http://schemas.microsoft.com/office/drawing/2016/5/10/chartex" xmlns:cx5="http://schemas.microsoft.com/office/drawing/2016/5/11/chartex" xmlns:cx6="http://schemas.microsoft.com/office/drawing/2016/5/12/chartex" xmlns:cx7="http://schemas.microsoft.com/office/drawing/2016/5/13/chartex" xmlns:cx8="http://schemas.microsoft.com/office/drawing/2016/5/14/chartex" xmlns:mc="http://schemas.openxmlformats.org/markup-compatibility/2006" xmlns:aink="http://schemas.microsoft.com/office/drawing/2016/ink" xmlns:am3d="http://schemas.microsoft.com/office/drawing/2017/model3d" xmlns:o="urn:schemas-microsoft-com:office:office" xmlns:oel="http://schemas.microsoft.com/office/2019/extlst" xmlns:r="http://schemas.openxmlformats.org/officeDocument/2006/relationships" xmlns:m="http://schemas.openxmlformats.org/officeDocument/2006/math" xmlns:v="urn:schemas-microsoft-com:vml" xmlns:wp14="http://schemas.microsoft.com/office/word/2010/wordprocessingDrawing" xmlns:wp="http://schemas.openxmlformats.org/drawingml/2006/wordprocessingDrawing" xmlns:w10="urn:schemas-microsoft-com:office:word" xmlns:w="http://schemas.openxmlformats.org/wordprocessingml/2006/main" xmlns:w14="http://schemas.microsoft.com/office/word/2010/wordml" xmlns:w15="http://schemas.microsoft.com/office/word/2012/wordml" xmlns:w16cex="http://schemas.microsoft.com/office/word/2018/wordml/cex" xmlns:w16cid="http://schemas.microsoft.com/office/word/2016/wordml/cid" xmlns:w16="http://schemas.microsoft.com/office/word/2018/wordml" xmlns:w16du="http://schemas.microsoft.com/office/word/2023/wordml/word16du" xmlns:w16sdtdh="http://schemas.microsoft.com/office/word/2020/wordml/sdtdatahash" xmlns:w16sdtfl="http://schemas.microsoft.com/office/word/2024/wordml/sdtformatlock" xmlns:w16se="http://schemas.microsoft.com/office/word/2015/wordml/symex" xmlns:wpg="http://schemas.microsoft.com/office/word/2010/wordprocessingGroup" xmlns:wpi="http://schemas.microsoft.com/office/word/2010/wordprocessingInk" xmlns:wne="http://schemas.microsoft.com/office/word/2006/wordml" xmlns:wps="http://schemas.microsoft.com/office/word/2010/wordprocessingShape" mc:Ignorable="w14 w15 w16se w16cid w16 w16cex w16sdtdh w16sdtfl w16du wp14">
   <w:body>
     <w:p>
       <w:pPr>
@@ -157,15 +157,7 @@
         <w:br/>
       </w:r>
       <w:r>
-        <w:t>--settingsfile=</w:t>
-      </w:r>
-      <w:proofErr w:type="gramStart"/>
-      <w:r>
-        <w:t>test_py_cwatm2.txt  --</w:t>
-      </w:r>
-      <w:proofErr w:type="gramEnd"/>
-      <w:r>
-        <w:t>cwatm=C:/work/CWATM/run_cwatm.py</w:t>
+        <w:t>--settingsfile=test_py_cwatm2.txt  --cwatm=C:/work/CWATM/run_cwatm.py</w:t>
       </w:r>
     </w:p>
     <w:p>
@@ -274,6 +266,13 @@
         </w:rPr>
         <w:t>PyCharm</w:t>
       </w:r>
+      <w:r>
+        <w:rPr>
+          <w:b/>
+          <w:bCs/>
+        </w:rPr>
+        <w:t xml:space="preserve"> (see below)</w:t>
+      </w:r>
     </w:p>
     <w:p/>
     <w:p>
@@ -304,15 +303,7 @@
         <w:t>F</w:t>
       </w:r>
       <w:r>
-        <w:t xml:space="preserve">older for CWatM testing results </w:t>
-      </w:r>
-      <w:proofErr w:type="gramStart"/>
-      <w:r>
-        <w:t>e.g.</w:t>
-      </w:r>
-      <w:proofErr w:type="gramEnd"/>
-      <w:r>
-        <w:t xml:space="preserve"> output/</w:t>
+        <w:t>older for CWatM testing results e.g. output/</w:t>
       </w:r>
       <w:proofErr w:type="spellStart"/>
       <w:r>
@@ -434,14 +425,12 @@
       <w:pPr>
         <w:spacing w:after="0"/>
       </w:pPr>
-      <w:proofErr w:type="gramStart"/>
       <w:r>
         <w:t>test_py_cwatm1.txt</w:t>
       </w:r>
       <w:r>
         <w:t>,..</w:t>
       </w:r>
-      <w:proofErr w:type="gramEnd"/>
       <w:r>
         <w:tab/>
       </w:r>
@@ -492,15 +481,7 @@
         <w:t xml:space="preserve">and </w:t>
       </w:r>
       <w:r>
-        <w:t xml:space="preserve">different options. Each testing </w:t>
-      </w:r>
-      <w:proofErr w:type="gramStart"/>
-      <w:r>
-        <w:t>e.g.</w:t>
-      </w:r>
-      <w:proofErr w:type="gramEnd"/>
-      <w:r>
-        <w:t xml:space="preserve"> for the Rhine basin 30 arcmin is using a settings template and varies different options during the test. Examples for tests are given below, but other tests can </w:t>
+        <w:t xml:space="preserve">different options. Each testing e.g. for the Rhine basin 30 arcmin is using a settings template and varies different options during the test. Examples for tests are given below, but other tests can </w:t>
       </w:r>
       <w:r>
         <w:t xml:space="preserve">be </w:t>
@@ -980,23 +961,7 @@
           <w:sz w:val="20"/>
           <w:szCs w:val="20"/>
         </w:rPr>
-        <w:t xml:space="preserve"> = True      =</w:t>
-      </w:r>
-      <w:proofErr w:type="gramStart"/>
-      <w:r>
-        <w:rPr>
-          <w:sz w:val="20"/>
-          <w:szCs w:val="20"/>
-        </w:rPr>
-        <w:t>&gt;  3.1</w:t>
-      </w:r>
-      <w:proofErr w:type="gramEnd"/>
-      <w:r>
-        <w:rPr>
-          <w:sz w:val="20"/>
-          <w:szCs w:val="20"/>
-        </w:rPr>
-        <w:t xml:space="preserve"> - 3.5 together</w:t>
+        <w:t xml:space="preserve"> = True      =&gt;  3.1 - 3.5 together</w:t>
       </w:r>
     </w:p>
     <w:p>
@@ -1144,23 +1109,7 @@
           <w:sz w:val="20"/>
           <w:szCs w:val="20"/>
         </w:rPr>
-        <w:t xml:space="preserve"> = False</w:t>
-      </w:r>
-      <w:proofErr w:type="gramStart"/>
-      <w:r>
-        <w:rPr>
-          <w:sz w:val="20"/>
-          <w:szCs w:val="20"/>
-        </w:rPr>
-        <w:t xml:space="preserve">   (</w:t>
-      </w:r>
-      <w:proofErr w:type="gramEnd"/>
-      <w:r>
-        <w:rPr>
-          <w:sz w:val="20"/>
-          <w:szCs w:val="20"/>
-        </w:rPr>
-        <w:t xml:space="preserve">some more </w:t>
+        <w:t xml:space="preserve"> = False   (some more </w:t>
       </w:r>
       <w:proofErr w:type="spellStart"/>
       <w:r>
@@ -1441,27 +1390,15 @@
       </w:r>
       <w:proofErr w:type="spellEnd"/>
       <w:r>
-        <w:t xml:space="preserve"> </w:t>
-      </w:r>
-      <w:proofErr w:type="gramStart"/>
-      <w:r>
-        <w:t>e.g.</w:t>
-      </w:r>
-      <w:proofErr w:type="gramEnd"/>
-      <w:r>
-        <w:t xml:space="preserve"> test_py_cwatm2.txt</w:t>
-      </w:r>
-    </w:p>
-    <w:p>
-      <w:pPr>
-        <w:spacing w:after="0" w:line="240" w:lineRule="auto"/>
-      </w:pPr>
-      <w:r>
-        <w:t xml:space="preserve">Mind </w:t>
-      </w:r>
-      <w:proofErr w:type="gramStart"/>
-      <w:r>
-        <w:t>the</w:t>
+        <w:t xml:space="preserve"> e.g. test_py_cwatm2.txt</w:t>
+      </w:r>
+    </w:p>
+    <w:p>
+      <w:pPr>
+        <w:spacing w:after="0" w:line="240" w:lineRule="auto"/>
+      </w:pPr>
+      <w:r>
+        <w:t>Mind the</w:t>
       </w:r>
       <w:r>
         <w:rPr>
@@ -1470,7 +1407,6 @@
         </w:rPr>
         <w:t xml:space="preserve"> ;</w:t>
       </w:r>
-      <w:proofErr w:type="gramEnd"/>
       <w:r>
         <w:t xml:space="preserve"> for separating the changes of the </w:t>
       </w:r>
@@ -1538,23 +1474,7 @@
           <w:sz w:val="20"/>
           <w:szCs w:val="20"/>
         </w:rPr>
-        <w:t>: Rhine_30</w:t>
-      </w:r>
-      <w:proofErr w:type="gramStart"/>
-      <w:r>
-        <w:rPr>
-          <w:sz w:val="20"/>
-          <w:szCs w:val="20"/>
-        </w:rPr>
-        <w:t>min  True</w:t>
-      </w:r>
-      <w:proofErr w:type="gramEnd"/>
-      <w:r>
-        <w:rPr>
-          <w:sz w:val="20"/>
-          <w:szCs w:val="20"/>
-        </w:rPr>
-        <w:t xml:space="preserve">    </w:t>
+        <w:t xml:space="preserve">: Rhine_30min  True    </w:t>
       </w:r>
       <w:r>
         <w:rPr>
@@ -1691,17 +1611,8 @@
           <w:sz w:val="20"/>
           <w:szCs w:val="20"/>
         </w:rPr>
-        <w:t>: global_5</w:t>
-      </w:r>
-      <w:proofErr w:type="gramStart"/>
-      <w:r>
-        <w:rPr>
-          <w:sz w:val="20"/>
-          <w:szCs w:val="20"/>
-        </w:rPr>
-        <w:t>min  False</w:t>
-      </w:r>
-      <w:proofErr w:type="gramEnd"/>
+        <w:t>: global_5min  False</w:t>
+      </w:r>
     </w:p>
     <w:p>
       <w:pPr>
@@ -1720,27 +1631,7 @@
           <w:sz w:val="20"/>
           <w:szCs w:val="20"/>
         </w:rPr>
-        <w:t>(</w:t>
-      </w:r>
-      <w:proofErr w:type="gramStart"/>
-      <w:r>
-        <w:rPr>
-          <w:b/>
-          <w:bCs/>
-          <w:sz w:val="20"/>
-          <w:szCs w:val="20"/>
-        </w:rPr>
-        <w:t>at</w:t>
-      </w:r>
-      <w:proofErr w:type="gramEnd"/>
-      <w:r>
-        <w:rPr>
-          <w:b/>
-          <w:bCs/>
-          <w:sz w:val="20"/>
-          <w:szCs w:val="20"/>
-        </w:rPr>
-        <w:t xml:space="preserve"> the moment only 4 tests, with several subtest, to be expanded!</w:t>
+        <w:t>(at the moment only 4 tests, with several subtest, to be expanded!</w:t>
       </w:r>
       <w:r>
         <w:rPr>
@@ -2187,21 +2078,12 @@
         <w:t>path_root</w:t>
       </w:r>
       <w:proofErr w:type="spellEnd"/>
-      <w:proofErr w:type="gramStart"/>
-      <w:r>
-        <w:rPr>
-          <w:sz w:val="20"/>
-          <w:szCs w:val="20"/>
-        </w:rPr>
-        <w:t>: .</w:t>
-      </w:r>
-      <w:proofErr w:type="gramEnd"/>
-      <w:r>
-        <w:rPr>
-          <w:sz w:val="20"/>
-          <w:szCs w:val="20"/>
-        </w:rPr>
-        <w:t>/</w:t>
+      <w:r>
+        <w:rPr>
+          <w:sz w:val="20"/>
+          <w:szCs w:val="20"/>
+        </w:rPr>
+        <w:t>: ./</w:t>
       </w:r>
     </w:p>
     <w:p>
@@ -2228,21 +2110,12 @@
         <w:t>path_init</w:t>
       </w:r>
       <w:proofErr w:type="spellEnd"/>
-      <w:proofErr w:type="gramStart"/>
-      <w:r>
-        <w:rPr>
-          <w:sz w:val="20"/>
-          <w:szCs w:val="20"/>
-        </w:rPr>
-        <w:t>: .</w:t>
-      </w:r>
-      <w:proofErr w:type="gramEnd"/>
-      <w:r>
-        <w:rPr>
-          <w:sz w:val="20"/>
-          <w:szCs w:val="20"/>
-        </w:rPr>
-        <w:t>/</w:t>
+      <w:r>
+        <w:rPr>
+          <w:sz w:val="20"/>
+          <w:szCs w:val="20"/>
+        </w:rPr>
+        <w:t>: ./</w:t>
       </w:r>
       <w:proofErr w:type="spellStart"/>
       <w:r>
@@ -2278,21 +2151,12 @@
         <w:t>path_out</w:t>
       </w:r>
       <w:proofErr w:type="spellEnd"/>
-      <w:proofErr w:type="gramStart"/>
-      <w:r>
-        <w:rPr>
-          <w:sz w:val="20"/>
-          <w:szCs w:val="20"/>
-        </w:rPr>
-        <w:t>: .</w:t>
-      </w:r>
-      <w:proofErr w:type="gramEnd"/>
-      <w:r>
-        <w:rPr>
-          <w:sz w:val="20"/>
-          <w:szCs w:val="20"/>
-        </w:rPr>
-        <w:t>/output/</w:t>
+      <w:r>
+        <w:rPr>
+          <w:sz w:val="20"/>
+          <w:szCs w:val="20"/>
+        </w:rPr>
+        <w:t>: ./output/</w:t>
       </w:r>
       <w:proofErr w:type="spellStart"/>
       <w:r>
@@ -2444,19 +2308,58 @@
           <w:sz w:val="20"/>
           <w:szCs w:val="20"/>
         </w:rPr>
-        <w:t xml:space="preserve">For the next test </w:t>
-      </w:r>
-      <w:proofErr w:type="gramStart"/>
-      <w:r>
+        <w:t>For the next test only these paths have to be included which have changed since the last test</w:t>
+      </w:r>
+    </w:p>
+    <w:p>
+      <w:pPr>
+        <w:spacing w:after="0" w:line="240" w:lineRule="auto"/>
+        <w:rPr>
+          <w:sz w:val="18"/>
+          <w:szCs w:val="18"/>
+        </w:rPr>
+      </w:pPr>
+      <w:r>
+        <w:rPr>
+          <w:sz w:val="18"/>
+          <w:szCs w:val="18"/>
+        </w:rPr>
+        <w:tab/>
+      </w:r>
+    </w:p>
+    <w:p>
+      <w:pPr>
+        <w:spacing w:after="0" w:line="240" w:lineRule="auto"/>
         <w:rPr>
           <w:b/>
           <w:bCs/>
           <w:sz w:val="20"/>
           <w:szCs w:val="20"/>
         </w:rPr>
-        <w:t>only</w:t>
-      </w:r>
-      <w:proofErr w:type="gramEnd"/>
+      </w:pPr>
+    </w:p>
+    <w:p>
+      <w:pPr>
+        <w:spacing w:after="0" w:line="240" w:lineRule="auto"/>
+        <w:rPr>
+          <w:sz w:val="20"/>
+          <w:szCs w:val="20"/>
+        </w:rPr>
+      </w:pPr>
+      <w:r>
+        <w:rPr>
+          <w:sz w:val="20"/>
+          <w:szCs w:val="20"/>
+        </w:rPr>
+        <w:t># 1st Rhine 30min</w:t>
+      </w:r>
+      <w:r>
+        <w:rPr>
+          <w:sz w:val="20"/>
+          <w:szCs w:val="20"/>
+        </w:rPr>
+        <w:t xml:space="preserve">  </w:t>
+      </w:r>
       <w:r>
         <w:rPr>
           <w:b/>
@@ -2464,7 +2367,431 @@
           <w:sz w:val="20"/>
           <w:szCs w:val="20"/>
         </w:rPr>
-        <w:t xml:space="preserve"> these paths have to be included which have changed since the last test</w:t>
+        <w:t>-&gt; first sub test</w:t>
+      </w:r>
+    </w:p>
+    <w:p>
+      <w:pPr>
+        <w:spacing w:after="0" w:line="240" w:lineRule="auto"/>
+        <w:rPr>
+          <w:sz w:val="20"/>
+          <w:szCs w:val="20"/>
+        </w:rPr>
+      </w:pPr>
+      <w:r>
+        <w:rPr>
+          <w:sz w:val="20"/>
+          <w:szCs w:val="20"/>
+        </w:rPr>
+        <w:t>header:      Rhine_30min_1</w:t>
+      </w:r>
+      <w:r>
+        <w:rPr>
+          <w:sz w:val="20"/>
+          <w:szCs w:val="20"/>
+        </w:rPr>
+        <w:t xml:space="preserve">  -&gt; name of the test</w:t>
+      </w:r>
+    </w:p>
+    <w:p>
+      <w:pPr>
+        <w:spacing w:after="0" w:line="240" w:lineRule="auto"/>
+        <w:rPr>
+          <w:sz w:val="20"/>
+          <w:szCs w:val="20"/>
+        </w:rPr>
+      </w:pPr>
+      <w:r>
+        <w:rPr>
+          <w:sz w:val="20"/>
+          <w:szCs w:val="20"/>
+        </w:rPr>
+        <w:t>description: 1st Rhine 30min basic version</w:t>
+      </w:r>
+      <w:r>
+        <w:rPr>
+          <w:sz w:val="20"/>
+          <w:szCs w:val="20"/>
+        </w:rPr>
+        <w:t xml:space="preserve"> </w:t>
+      </w:r>
+    </w:p>
+    <w:p>
+      <w:pPr>
+        <w:spacing w:after="0" w:line="240" w:lineRule="auto"/>
+        <w:rPr>
+          <w:sz w:val="20"/>
+          <w:szCs w:val="20"/>
+        </w:rPr>
+      </w:pPr>
+      <w:proofErr w:type="spellStart"/>
+      <w:r>
+        <w:rPr>
+          <w:sz w:val="20"/>
+          <w:szCs w:val="20"/>
+        </w:rPr>
+        <w:t>set_save</w:t>
+      </w:r>
+      <w:proofErr w:type="spellEnd"/>
+      <w:r>
+        <w:rPr>
+          <w:sz w:val="20"/>
+          <w:szCs w:val="20"/>
+        </w:rPr>
+        <w:t>:    settings_rhine_30min_01.ini</w:t>
+      </w:r>
+      <w:r>
+        <w:rPr>
+          <w:sz w:val="20"/>
+          <w:szCs w:val="20"/>
+        </w:rPr>
+        <w:t xml:space="preserve"> </w:t>
+      </w:r>
+    </w:p>
+    <w:p>
+      <w:pPr>
+        <w:spacing w:after="0" w:line="240" w:lineRule="auto"/>
+        <w:rPr>
+          <w:b/>
+          <w:bCs/>
+          <w:sz w:val="20"/>
+          <w:szCs w:val="20"/>
+        </w:rPr>
+      </w:pPr>
+      <w:r>
+        <w:rPr>
+          <w:b/>
+          <w:bCs/>
+          <w:sz w:val="20"/>
+          <w:szCs w:val="20"/>
+        </w:rPr>
+        <w:t xml:space="preserve">-&gt; </w:t>
+      </w:r>
+      <w:r>
+        <w:rPr>
+          <w:b/>
+          <w:bCs/>
+          <w:sz w:val="20"/>
+          <w:szCs w:val="20"/>
+        </w:rPr>
+        <w:t xml:space="preserve">name of the changed settings file, this file is added in the template </w:t>
+      </w:r>
+      <w:proofErr w:type="spellStart"/>
+      <w:r>
+        <w:rPr>
+          <w:b/>
+          <w:bCs/>
+          <w:sz w:val="20"/>
+          <w:szCs w:val="20"/>
+        </w:rPr>
+        <w:t>settingsfile</w:t>
+      </w:r>
+      <w:proofErr w:type="spellEnd"/>
+      <w:r>
+        <w:rPr>
+          <w:b/>
+          <w:bCs/>
+          <w:sz w:val="20"/>
+          <w:szCs w:val="20"/>
+        </w:rPr>
+        <w:t xml:space="preserve"> folder</w:t>
+      </w:r>
+    </w:p>
+    <w:p>
+      <w:pPr>
+        <w:spacing w:after="0" w:line="240" w:lineRule="auto"/>
+        <w:rPr>
+          <w:sz w:val="20"/>
+          <w:szCs w:val="20"/>
+        </w:rPr>
+      </w:pPr>
+      <w:r>
+        <w:rPr>
+          <w:sz w:val="20"/>
+          <w:szCs w:val="20"/>
+        </w:rPr>
+        <w:t xml:space="preserve">changes:     </w:t>
+      </w:r>
+      <w:r>
+        <w:rPr>
+          <w:b/>
+          <w:bCs/>
+          <w:sz w:val="20"/>
+          <w:szCs w:val="20"/>
+        </w:rPr>
+        <w:t xml:space="preserve">-&gt; changes of the CWatM </w:t>
+      </w:r>
+      <w:proofErr w:type="spellStart"/>
+      <w:r>
+        <w:rPr>
+          <w:b/>
+          <w:bCs/>
+          <w:sz w:val="20"/>
+          <w:szCs w:val="20"/>
+        </w:rPr>
+        <w:t>settingsfile</w:t>
+      </w:r>
+      <w:proofErr w:type="spellEnd"/>
+      <w:r>
+        <w:rPr>
+          <w:b/>
+          <w:bCs/>
+          <w:sz w:val="20"/>
+          <w:szCs w:val="20"/>
+        </w:rPr>
+        <w:t>, here: no changes</w:t>
+      </w:r>
+    </w:p>
+    <w:p>
+      <w:pPr>
+        <w:spacing w:after="0" w:line="240" w:lineRule="auto"/>
+        <w:rPr>
+          <w:sz w:val="20"/>
+          <w:szCs w:val="20"/>
+        </w:rPr>
+      </w:pPr>
+      <w:r>
+        <w:rPr>
+          <w:sz w:val="20"/>
+          <w:szCs w:val="20"/>
+        </w:rPr>
+        <w:t xml:space="preserve">adds:        </w:t>
+      </w:r>
+      <w:r>
+        <w:rPr>
+          <w:sz w:val="20"/>
+          <w:szCs w:val="20"/>
+        </w:rPr>
+        <w:t xml:space="preserve">   </w:t>
+      </w:r>
+      <w:r>
+        <w:rPr>
+          <w:b/>
+          <w:bCs/>
+          <w:sz w:val="20"/>
+          <w:szCs w:val="20"/>
+        </w:rPr>
+        <w:t xml:space="preserve">-&gt; add to the CWatM </w:t>
+      </w:r>
+      <w:proofErr w:type="spellStart"/>
+      <w:r>
+        <w:rPr>
+          <w:b/>
+          <w:bCs/>
+          <w:sz w:val="20"/>
+          <w:szCs w:val="20"/>
+        </w:rPr>
+        <w:t>settingsfile</w:t>
+      </w:r>
+      <w:proofErr w:type="spellEnd"/>
+      <w:r>
+        <w:rPr>
+          <w:b/>
+          <w:bCs/>
+          <w:sz w:val="20"/>
+          <w:szCs w:val="20"/>
+        </w:rPr>
+        <w:t>, here: no adds</w:t>
+      </w:r>
+    </w:p>
+    <w:p>
+      <w:pPr>
+        <w:spacing w:after="0" w:line="240" w:lineRule="auto"/>
+        <w:rPr>
+          <w:sz w:val="20"/>
+          <w:szCs w:val="20"/>
+        </w:rPr>
+      </w:pPr>
+      <w:proofErr w:type="spellStart"/>
+      <w:r>
+        <w:rPr>
+          <w:sz w:val="20"/>
+          <w:szCs w:val="20"/>
+        </w:rPr>
+        <w:t>last_value</w:t>
+      </w:r>
+      <w:proofErr w:type="spellEnd"/>
+      <w:r>
+        <w:rPr>
+          <w:sz w:val="20"/>
+          <w:szCs w:val="20"/>
+        </w:rPr>
+        <w:t>:  4.22</w:t>
+      </w:r>
+      <w:r>
+        <w:rPr>
+          <w:sz w:val="20"/>
+          <w:szCs w:val="20"/>
+        </w:rPr>
+        <w:t xml:space="preserve"> </w:t>
+      </w:r>
+      <w:r>
+        <w:rPr>
+          <w:b/>
+          <w:bCs/>
+          <w:sz w:val="20"/>
+          <w:szCs w:val="20"/>
+        </w:rPr>
+        <w:t xml:space="preserve"> -&gt; last value of discharge to check against if </w:t>
+      </w:r>
+      <w:proofErr w:type="spellStart"/>
+      <w:r>
+        <w:rPr>
+          <w:b/>
+          <w:bCs/>
+          <w:sz w:val="20"/>
+          <w:szCs w:val="20"/>
+        </w:rPr>
+        <w:t>test_value</w:t>
+      </w:r>
+      <w:proofErr w:type="spellEnd"/>
+      <w:r>
+        <w:rPr>
+          <w:b/>
+          <w:bCs/>
+          <w:sz w:val="20"/>
+          <w:szCs w:val="20"/>
+        </w:rPr>
+        <w:t>=True</w:t>
+      </w:r>
+    </w:p>
+    <w:p>
+      <w:pPr>
+        <w:spacing w:after="0" w:line="240" w:lineRule="auto"/>
+        <w:rPr>
+          <w:sz w:val="20"/>
+          <w:szCs w:val="20"/>
+        </w:rPr>
+      </w:pPr>
+    </w:p>
+    <w:p>
+      <w:pPr>
+        <w:spacing w:after="0" w:line="240" w:lineRule="auto"/>
+        <w:rPr>
+          <w:sz w:val="20"/>
+          <w:szCs w:val="20"/>
+        </w:rPr>
+      </w:pPr>
+      <w:r>
+        <w:rPr>
+          <w:sz w:val="20"/>
+          <w:szCs w:val="20"/>
+        </w:rPr>
+        <w:t>….</w:t>
+      </w:r>
+    </w:p>
+    <w:p>
+      <w:pPr>
+        <w:spacing w:after="0" w:line="240" w:lineRule="auto"/>
+        <w:rPr>
+          <w:sz w:val="20"/>
+          <w:szCs w:val="20"/>
+        </w:rPr>
+      </w:pPr>
+    </w:p>
+    <w:p>
+      <w:pPr>
+        <w:spacing w:after="0" w:line="240" w:lineRule="auto"/>
+        <w:rPr>
+          <w:sz w:val="20"/>
+          <w:szCs w:val="20"/>
+        </w:rPr>
+      </w:pPr>
+      <w:r>
+        <w:rPr>
+          <w:sz w:val="20"/>
+          <w:szCs w:val="20"/>
+        </w:rPr>
+        <w:t># 7th setup Rhine</w:t>
+      </w:r>
+      <w:r>
+        <w:rPr>
+          <w:sz w:val="20"/>
+          <w:szCs w:val="20"/>
+        </w:rPr>
+        <w:t xml:space="preserve">  </w:t>
+      </w:r>
+      <w:r>
+        <w:rPr>
+          <w:b/>
+          <w:bCs/>
+          <w:sz w:val="20"/>
+          <w:szCs w:val="20"/>
+        </w:rPr>
+        <w:t>-&gt; sub test no. 7</w:t>
+      </w:r>
+    </w:p>
+    <w:p>
+      <w:pPr>
+        <w:spacing w:after="0" w:line="240" w:lineRule="auto"/>
+        <w:rPr>
+          <w:sz w:val="20"/>
+          <w:szCs w:val="20"/>
+        </w:rPr>
+      </w:pPr>
+      <w:r>
+        <w:rPr>
+          <w:sz w:val="20"/>
+          <w:szCs w:val="20"/>
+        </w:rPr>
+        <w:t>header:      Rhine_30min_7</w:t>
+      </w:r>
+    </w:p>
+    <w:p>
+      <w:pPr>
+        <w:spacing w:after="0" w:line="240" w:lineRule="auto"/>
+        <w:rPr>
+          <w:sz w:val="20"/>
+          <w:szCs w:val="20"/>
+        </w:rPr>
+      </w:pPr>
+      <w:r>
+        <w:rPr>
+          <w:sz w:val="20"/>
+          <w:szCs w:val="20"/>
+        </w:rPr>
+        <w:t xml:space="preserve">description: 7th Rhine 30min with </w:t>
+      </w:r>
+      <w:proofErr w:type="spellStart"/>
+      <w:r>
+        <w:rPr>
+          <w:sz w:val="20"/>
+          <w:szCs w:val="20"/>
+        </w:rPr>
+        <w:t>waterdemand</w:t>
+      </w:r>
+      <w:proofErr w:type="spellEnd"/>
+      <w:r>
+        <w:rPr>
+          <w:sz w:val="20"/>
+          <w:szCs w:val="20"/>
+        </w:rPr>
+        <w:t xml:space="preserve"> TRUE</w:t>
+      </w:r>
+    </w:p>
+    <w:p>
+      <w:pPr>
+        <w:spacing w:after="0" w:line="240" w:lineRule="auto"/>
+        <w:rPr>
+          <w:sz w:val="20"/>
+          <w:szCs w:val="20"/>
+        </w:rPr>
+      </w:pPr>
+      <w:proofErr w:type="spellStart"/>
+      <w:r>
+        <w:rPr>
+          <w:sz w:val="20"/>
+          <w:szCs w:val="20"/>
+        </w:rPr>
+        <w:t>set_save</w:t>
+      </w:r>
+      <w:proofErr w:type="spellEnd"/>
+      <w:r>
+        <w:rPr>
+          <w:sz w:val="20"/>
+          <w:szCs w:val="20"/>
+        </w:rPr>
+        <w:t>:    settings_rhine_30min_07.ini</w:t>
       </w:r>
     </w:p>
     <w:p>
@@ -2477,10 +2804,178 @@
       </w:pPr>
       <w:r>
         <w:rPr>
+          <w:sz w:val="20"/>
+          <w:szCs w:val="20"/>
+        </w:rPr>
+        <w:t xml:space="preserve">changes:     </w:t>
+      </w:r>
+      <w:proofErr w:type="spellStart"/>
+      <w:r>
+        <w:rPr>
           <w:sz w:val="18"/>
           <w:szCs w:val="18"/>
         </w:rPr>
-        <w:tab/>
+        <w:t>calc_evaporation</w:t>
+      </w:r>
+      <w:proofErr w:type="spellEnd"/>
+      <w:r>
+        <w:rPr>
+          <w:sz w:val="18"/>
+          <w:szCs w:val="18"/>
+        </w:rPr>
+        <w:t xml:space="preserve"> = False; </w:t>
+      </w:r>
+      <w:proofErr w:type="spellStart"/>
+      <w:r>
+        <w:rPr>
+          <w:sz w:val="18"/>
+          <w:szCs w:val="18"/>
+        </w:rPr>
+        <w:t>includeIrrigation</w:t>
+      </w:r>
+      <w:proofErr w:type="spellEnd"/>
+      <w:r>
+        <w:rPr>
+          <w:sz w:val="18"/>
+          <w:szCs w:val="18"/>
+        </w:rPr>
+        <w:t xml:space="preserve"> = True; </w:t>
+      </w:r>
+      <w:proofErr w:type="spellStart"/>
+      <w:r>
+        <w:rPr>
+          <w:sz w:val="18"/>
+          <w:szCs w:val="18"/>
+        </w:rPr>
+        <w:t>preferentialFlow</w:t>
+      </w:r>
+      <w:proofErr w:type="spellEnd"/>
+      <w:r>
+        <w:rPr>
+          <w:sz w:val="18"/>
+          <w:szCs w:val="18"/>
+        </w:rPr>
+        <w:t xml:space="preserve"> = True; </w:t>
+      </w:r>
+      <w:proofErr w:type="spellStart"/>
+      <w:r>
+        <w:rPr>
+          <w:sz w:val="18"/>
+          <w:szCs w:val="18"/>
+        </w:rPr>
+        <w:t>CapillarRise</w:t>
+      </w:r>
+      <w:proofErr w:type="spellEnd"/>
+      <w:r>
+        <w:rPr>
+          <w:sz w:val="18"/>
+          <w:szCs w:val="18"/>
+        </w:rPr>
+        <w:t xml:space="preserve"> = True;</w:t>
+      </w:r>
+      <w:r>
+        <w:rPr>
+          <w:sz w:val="18"/>
+          <w:szCs w:val="18"/>
+        </w:rPr>
+        <w:br/>
+        <w:t xml:space="preserve">                       </w:t>
+      </w:r>
+      <w:proofErr w:type="spellStart"/>
+      <w:r>
+        <w:rPr>
+          <w:sz w:val="18"/>
+          <w:szCs w:val="18"/>
+        </w:rPr>
+        <w:t>includeRunoffConcentration</w:t>
+      </w:r>
+      <w:proofErr w:type="spellEnd"/>
+      <w:r>
+        <w:rPr>
+          <w:sz w:val="18"/>
+          <w:szCs w:val="18"/>
+        </w:rPr>
+        <w:t xml:space="preserve"> = True; </w:t>
+      </w:r>
+      <w:proofErr w:type="spellStart"/>
+      <w:r>
+        <w:rPr>
+          <w:sz w:val="18"/>
+          <w:szCs w:val="18"/>
+        </w:rPr>
+        <w:t>includeWaterBodies</w:t>
+      </w:r>
+      <w:proofErr w:type="spellEnd"/>
+      <w:r>
+        <w:rPr>
+          <w:sz w:val="18"/>
+          <w:szCs w:val="18"/>
+        </w:rPr>
+        <w:t xml:space="preserve"> = True; </w:t>
+      </w:r>
+      <w:proofErr w:type="spellStart"/>
+      <w:r>
+        <w:rPr>
+          <w:sz w:val="18"/>
+          <w:szCs w:val="18"/>
+        </w:rPr>
+        <w:t>includeWaterDemand</w:t>
+      </w:r>
+      <w:proofErr w:type="spellEnd"/>
+      <w:r>
+        <w:rPr>
+          <w:sz w:val="18"/>
+          <w:szCs w:val="18"/>
+        </w:rPr>
+        <w:t xml:space="preserve"> = True; </w:t>
+      </w:r>
+      <w:proofErr w:type="spellStart"/>
+      <w:r>
+        <w:rPr>
+          <w:sz w:val="18"/>
+          <w:szCs w:val="18"/>
+        </w:rPr>
+        <w:t>StepEnd</w:t>
+      </w:r>
+      <w:proofErr w:type="spellEnd"/>
+      <w:r>
+        <w:rPr>
+          <w:sz w:val="18"/>
+          <w:szCs w:val="18"/>
+        </w:rPr>
+        <w:t xml:space="preserve"> = 40</w:t>
+      </w:r>
+    </w:p>
+    <w:p>
+      <w:pPr>
+        <w:spacing w:after="0" w:line="240" w:lineRule="auto"/>
+        <w:rPr>
+          <w:sz w:val="20"/>
+          <w:szCs w:val="20"/>
+        </w:rPr>
+      </w:pPr>
+      <w:r>
+        <w:rPr>
+          <w:sz w:val="20"/>
+          <w:szCs w:val="20"/>
+        </w:rPr>
+        <w:t xml:space="preserve">adds:        </w:t>
+      </w:r>
+      <w:proofErr w:type="spellStart"/>
+      <w:r>
+        <w:rPr>
+          <w:sz w:val="20"/>
+          <w:szCs w:val="20"/>
+        </w:rPr>
+        <w:t>OUT_TSS_Daily</w:t>
+      </w:r>
+      <w:proofErr w:type="spellEnd"/>
+      <w:r>
+        <w:rPr>
+          <w:sz w:val="20"/>
+          <w:szCs w:val="20"/>
+        </w:rPr>
+        <w:t xml:space="preserve"> = discharge</w:t>
       </w:r>
     </w:p>
     <w:p>
@@ -2493,36 +2988,21 @@
           <w:szCs w:val="20"/>
         </w:rPr>
       </w:pPr>
-    </w:p>
-    <w:p>
-      <w:pPr>
-        <w:spacing w:after="0" w:line="240" w:lineRule="auto"/>
-        <w:rPr>
-          <w:sz w:val="20"/>
-          <w:szCs w:val="20"/>
-        </w:rPr>
-      </w:pPr>
-      <w:r>
-        <w:rPr>
-          <w:sz w:val="20"/>
-          <w:szCs w:val="20"/>
-        </w:rPr>
-        <w:t># 1st Rhine 30</w:t>
-      </w:r>
-      <w:proofErr w:type="gramStart"/>
-      <w:r>
-        <w:rPr>
-          <w:sz w:val="20"/>
-          <w:szCs w:val="20"/>
-        </w:rPr>
-        <w:t>min</w:t>
-      </w:r>
-      <w:r>
-        <w:rPr>
-          <w:sz w:val="20"/>
-          <w:szCs w:val="20"/>
-        </w:rPr>
-        <w:t xml:space="preserve">  </w:t>
+      <w:proofErr w:type="spellStart"/>
+      <w:r>
+        <w:rPr>
+          <w:sz w:val="20"/>
+          <w:szCs w:val="20"/>
+        </w:rPr>
+        <w:t>last_value</w:t>
+      </w:r>
+      <w:proofErr w:type="spellEnd"/>
+      <w:r>
+        <w:rPr>
+          <w:sz w:val="20"/>
+          <w:szCs w:val="20"/>
+        </w:rPr>
+        <w:t>:  443.03</w:t>
       </w:r>
       <w:r>
         <w:rPr>
@@ -2531,9 +3011,81 @@
           <w:sz w:val="20"/>
           <w:szCs w:val="20"/>
         </w:rPr>
-        <w:t>-</w:t>
-      </w:r>
-      <w:proofErr w:type="gramEnd"/>
+        <w:tab/>
+      </w:r>
+    </w:p>
+    <w:p>
+      <w:pPr>
+        <w:spacing w:after="0" w:line="240" w:lineRule="auto"/>
+        <w:rPr>
+          <w:sz w:val="20"/>
+          <w:szCs w:val="20"/>
+        </w:rPr>
+      </w:pPr>
+    </w:p>
+    <w:p>
+      <w:pPr>
+        <w:spacing w:after="0" w:line="240" w:lineRule="auto"/>
+        <w:rPr>
+          <w:sz w:val="20"/>
+          <w:szCs w:val="20"/>
+        </w:rPr>
+      </w:pPr>
+      <w:r>
+        <w:rPr>
+          <w:sz w:val="20"/>
+          <w:szCs w:val="20"/>
+        </w:rPr>
+        <w:t>….</w:t>
+      </w:r>
+    </w:p>
+    <w:p>
+      <w:pPr>
+        <w:spacing w:after="0" w:line="240" w:lineRule="auto"/>
+        <w:rPr>
+          <w:sz w:val="20"/>
+          <w:szCs w:val="20"/>
+        </w:rPr>
+      </w:pPr>
+    </w:p>
+    <w:p>
+      <w:pPr>
+        <w:spacing w:after="0" w:line="240" w:lineRule="auto"/>
+        <w:rPr>
+          <w:sz w:val="20"/>
+          <w:szCs w:val="20"/>
+        </w:rPr>
+      </w:pPr>
+      <w:r>
+        <w:rPr>
+          <w:sz w:val="20"/>
+          <w:szCs w:val="20"/>
+        </w:rPr>
+        <w:t># -----------------------------</w:t>
+      </w:r>
+    </w:p>
+    <w:p>
+      <w:pPr>
+        <w:spacing w:after="0" w:line="240" w:lineRule="auto"/>
+        <w:rPr>
+          <w:sz w:val="20"/>
+          <w:szCs w:val="20"/>
+        </w:rPr>
+      </w:pPr>
+      <w:r>
+        <w:rPr>
+          <w:sz w:val="20"/>
+          <w:szCs w:val="20"/>
+        </w:rPr>
+        <w:t xml:space="preserve">    # Global</w:t>
+      </w:r>
+      <w:r>
+        <w:rPr>
+          <w:sz w:val="20"/>
+          <w:szCs w:val="20"/>
+        </w:rPr>
+        <w:t xml:space="preserve">  </w:t>
+      </w:r>
       <w:r>
         <w:rPr>
           <w:b/>
@@ -2541,803 +3093,7 @@
           <w:sz w:val="20"/>
           <w:szCs w:val="20"/>
         </w:rPr>
-        <w:t>&gt; first sub test</w:t>
-      </w:r>
-    </w:p>
-    <w:p>
-      <w:pPr>
-        <w:spacing w:after="0" w:line="240" w:lineRule="auto"/>
-        <w:rPr>
-          <w:sz w:val="20"/>
-          <w:szCs w:val="20"/>
-        </w:rPr>
-      </w:pPr>
-      <w:r>
-        <w:rPr>
-          <w:sz w:val="20"/>
-          <w:szCs w:val="20"/>
-        </w:rPr>
-        <w:t>header:      Rhine_30min_</w:t>
-      </w:r>
-      <w:proofErr w:type="gramStart"/>
-      <w:r>
-        <w:rPr>
-          <w:sz w:val="20"/>
-          <w:szCs w:val="20"/>
-        </w:rPr>
-        <w:t>1</w:t>
-      </w:r>
-      <w:r>
-        <w:rPr>
-          <w:sz w:val="20"/>
-          <w:szCs w:val="20"/>
-        </w:rPr>
-        <w:t xml:space="preserve">  -</w:t>
-      </w:r>
-      <w:proofErr w:type="gramEnd"/>
-      <w:r>
-        <w:rPr>
-          <w:sz w:val="20"/>
-          <w:szCs w:val="20"/>
-        </w:rPr>
-        <w:t>&gt; name of the test</w:t>
-      </w:r>
-    </w:p>
-    <w:p>
-      <w:pPr>
-        <w:spacing w:after="0" w:line="240" w:lineRule="auto"/>
-        <w:rPr>
-          <w:sz w:val="20"/>
-          <w:szCs w:val="20"/>
-        </w:rPr>
-      </w:pPr>
-      <w:r>
-        <w:rPr>
-          <w:sz w:val="20"/>
-          <w:szCs w:val="20"/>
-        </w:rPr>
-        <w:t>description: 1st Rhine 30min basic version</w:t>
-      </w:r>
-      <w:r>
-        <w:rPr>
-          <w:sz w:val="20"/>
-          <w:szCs w:val="20"/>
-        </w:rPr>
-        <w:t xml:space="preserve"> </w:t>
-      </w:r>
-    </w:p>
-    <w:p>
-      <w:pPr>
-        <w:spacing w:after="0" w:line="240" w:lineRule="auto"/>
-        <w:rPr>
-          <w:sz w:val="20"/>
-          <w:szCs w:val="20"/>
-        </w:rPr>
-      </w:pPr>
-      <w:proofErr w:type="spellStart"/>
-      <w:r>
-        <w:rPr>
-          <w:sz w:val="20"/>
-          <w:szCs w:val="20"/>
-        </w:rPr>
-        <w:t>set_save</w:t>
-      </w:r>
-      <w:proofErr w:type="spellEnd"/>
-      <w:r>
-        <w:rPr>
-          <w:sz w:val="20"/>
-          <w:szCs w:val="20"/>
-        </w:rPr>
-        <w:t>:    settings_rhine_30min_01.ini</w:t>
-      </w:r>
-      <w:r>
-        <w:rPr>
-          <w:sz w:val="20"/>
-          <w:szCs w:val="20"/>
-        </w:rPr>
-        <w:t xml:space="preserve"> </w:t>
-      </w:r>
-    </w:p>
-    <w:p>
-      <w:pPr>
-        <w:spacing w:after="0" w:line="240" w:lineRule="auto"/>
-        <w:rPr>
-          <w:b/>
-          <w:bCs/>
-          <w:sz w:val="20"/>
-          <w:szCs w:val="20"/>
-        </w:rPr>
-      </w:pPr>
-      <w:r>
-        <w:rPr>
-          <w:b/>
-          <w:bCs/>
-          <w:sz w:val="20"/>
-          <w:szCs w:val="20"/>
-        </w:rPr>
-        <w:t xml:space="preserve">-&gt; </w:t>
-      </w:r>
-      <w:r>
-        <w:rPr>
-          <w:b/>
-          <w:bCs/>
-          <w:sz w:val="20"/>
-          <w:szCs w:val="20"/>
-        </w:rPr>
-        <w:t xml:space="preserve">name of the changed settings file, this file is added in the template </w:t>
-      </w:r>
-      <w:proofErr w:type="spellStart"/>
-      <w:r>
-        <w:rPr>
-          <w:b/>
-          <w:bCs/>
-          <w:sz w:val="20"/>
-          <w:szCs w:val="20"/>
-        </w:rPr>
-        <w:t>settingsfile</w:t>
-      </w:r>
-      <w:proofErr w:type="spellEnd"/>
-      <w:r>
-        <w:rPr>
-          <w:b/>
-          <w:bCs/>
-          <w:sz w:val="20"/>
-          <w:szCs w:val="20"/>
-        </w:rPr>
-        <w:t xml:space="preserve"> folder</w:t>
-      </w:r>
-    </w:p>
-    <w:p>
-      <w:pPr>
-        <w:spacing w:after="0" w:line="240" w:lineRule="auto"/>
-        <w:rPr>
-          <w:sz w:val="20"/>
-          <w:szCs w:val="20"/>
-        </w:rPr>
-      </w:pPr>
-      <w:r>
-        <w:rPr>
-          <w:sz w:val="20"/>
-          <w:szCs w:val="20"/>
-        </w:rPr>
-        <w:t xml:space="preserve">changes:     </w:t>
-      </w:r>
-      <w:r>
-        <w:rPr>
-          <w:b/>
-          <w:bCs/>
-          <w:sz w:val="20"/>
-          <w:szCs w:val="20"/>
-        </w:rPr>
-        <w:t xml:space="preserve">-&gt; changes of the CWatM </w:t>
-      </w:r>
-      <w:proofErr w:type="spellStart"/>
-      <w:r>
-        <w:rPr>
-          <w:b/>
-          <w:bCs/>
-          <w:sz w:val="20"/>
-          <w:szCs w:val="20"/>
-        </w:rPr>
-        <w:t>settingsfile</w:t>
-      </w:r>
-      <w:proofErr w:type="spellEnd"/>
-      <w:r>
-        <w:rPr>
-          <w:b/>
-          <w:bCs/>
-          <w:sz w:val="20"/>
-          <w:szCs w:val="20"/>
-        </w:rPr>
-        <w:t>, here: no changes</w:t>
-      </w:r>
-    </w:p>
-    <w:p>
-      <w:pPr>
-        <w:spacing w:after="0" w:line="240" w:lineRule="auto"/>
-        <w:rPr>
-          <w:sz w:val="20"/>
-          <w:szCs w:val="20"/>
-        </w:rPr>
-      </w:pPr>
-      <w:r>
-        <w:rPr>
-          <w:sz w:val="20"/>
-          <w:szCs w:val="20"/>
-        </w:rPr>
-        <w:t xml:space="preserve">adds:        </w:t>
-      </w:r>
-      <w:r>
-        <w:rPr>
-          <w:sz w:val="20"/>
-          <w:szCs w:val="20"/>
-        </w:rPr>
-        <w:t xml:space="preserve">   </w:t>
-      </w:r>
-      <w:r>
-        <w:rPr>
-          <w:b/>
-          <w:bCs/>
-          <w:sz w:val="20"/>
-          <w:szCs w:val="20"/>
-        </w:rPr>
-        <w:t xml:space="preserve">-&gt; add to the CWatM </w:t>
-      </w:r>
-      <w:proofErr w:type="spellStart"/>
-      <w:r>
-        <w:rPr>
-          <w:b/>
-          <w:bCs/>
-          <w:sz w:val="20"/>
-          <w:szCs w:val="20"/>
-        </w:rPr>
-        <w:t>settingsfile</w:t>
-      </w:r>
-      <w:proofErr w:type="spellEnd"/>
-      <w:r>
-        <w:rPr>
-          <w:b/>
-          <w:bCs/>
-          <w:sz w:val="20"/>
-          <w:szCs w:val="20"/>
-        </w:rPr>
-        <w:t>, here: no adds</w:t>
-      </w:r>
-    </w:p>
-    <w:p>
-      <w:pPr>
-        <w:spacing w:after="0" w:line="240" w:lineRule="auto"/>
-        <w:rPr>
-          <w:sz w:val="20"/>
-          <w:szCs w:val="20"/>
-        </w:rPr>
-      </w:pPr>
-      <w:proofErr w:type="spellStart"/>
-      <w:r>
-        <w:rPr>
-          <w:sz w:val="20"/>
-          <w:szCs w:val="20"/>
-        </w:rPr>
-        <w:t>last_value</w:t>
-      </w:r>
-      <w:proofErr w:type="spellEnd"/>
-      <w:r>
-        <w:rPr>
-          <w:sz w:val="20"/>
-          <w:szCs w:val="20"/>
-        </w:rPr>
-        <w:t xml:space="preserve">:  </w:t>
-      </w:r>
-      <w:proofErr w:type="gramStart"/>
-      <w:r>
-        <w:rPr>
-          <w:sz w:val="20"/>
-          <w:szCs w:val="20"/>
-        </w:rPr>
-        <w:t>4.22</w:t>
-      </w:r>
-      <w:r>
-        <w:rPr>
-          <w:sz w:val="20"/>
-          <w:szCs w:val="20"/>
-        </w:rPr>
-        <w:t xml:space="preserve"> </w:t>
-      </w:r>
-      <w:r>
-        <w:rPr>
-          <w:b/>
-          <w:bCs/>
-          <w:sz w:val="20"/>
-          <w:szCs w:val="20"/>
-        </w:rPr>
-        <w:t xml:space="preserve"> -</w:t>
-      </w:r>
-      <w:proofErr w:type="gramEnd"/>
-      <w:r>
-        <w:rPr>
-          <w:b/>
-          <w:bCs/>
-          <w:sz w:val="20"/>
-          <w:szCs w:val="20"/>
-        </w:rPr>
-        <w:t xml:space="preserve">&gt; last value of discharge to check against if </w:t>
-      </w:r>
-      <w:proofErr w:type="spellStart"/>
-      <w:r>
-        <w:rPr>
-          <w:b/>
-          <w:bCs/>
-          <w:sz w:val="20"/>
-          <w:szCs w:val="20"/>
-        </w:rPr>
-        <w:t>test_value</w:t>
-      </w:r>
-      <w:proofErr w:type="spellEnd"/>
-      <w:r>
-        <w:rPr>
-          <w:b/>
-          <w:bCs/>
-          <w:sz w:val="20"/>
-          <w:szCs w:val="20"/>
-        </w:rPr>
-        <w:t>=True</w:t>
-      </w:r>
-    </w:p>
-    <w:p>
-      <w:pPr>
-        <w:spacing w:after="0" w:line="240" w:lineRule="auto"/>
-        <w:rPr>
-          <w:sz w:val="20"/>
-          <w:szCs w:val="20"/>
-        </w:rPr>
-      </w:pPr>
-    </w:p>
-    <w:p>
-      <w:pPr>
-        <w:spacing w:after="0" w:line="240" w:lineRule="auto"/>
-        <w:rPr>
-          <w:sz w:val="20"/>
-          <w:szCs w:val="20"/>
-        </w:rPr>
-      </w:pPr>
-      <w:r>
-        <w:rPr>
-          <w:sz w:val="20"/>
-          <w:szCs w:val="20"/>
-        </w:rPr>
-        <w:t>….</w:t>
-      </w:r>
-    </w:p>
-    <w:p>
-      <w:pPr>
-        <w:spacing w:after="0" w:line="240" w:lineRule="auto"/>
-        <w:rPr>
-          <w:sz w:val="20"/>
-          <w:szCs w:val="20"/>
-        </w:rPr>
-      </w:pPr>
-    </w:p>
-    <w:p>
-      <w:pPr>
-        <w:spacing w:after="0" w:line="240" w:lineRule="auto"/>
-        <w:rPr>
-          <w:sz w:val="20"/>
-          <w:szCs w:val="20"/>
-        </w:rPr>
-      </w:pPr>
-      <w:r>
-        <w:rPr>
-          <w:sz w:val="20"/>
-          <w:szCs w:val="20"/>
-        </w:rPr>
-        <w:t xml:space="preserve"># 7th setup </w:t>
-      </w:r>
-      <w:proofErr w:type="gramStart"/>
-      <w:r>
-        <w:rPr>
-          <w:sz w:val="20"/>
-          <w:szCs w:val="20"/>
-        </w:rPr>
-        <w:t>Rhine</w:t>
-      </w:r>
-      <w:r>
-        <w:rPr>
-          <w:sz w:val="20"/>
-          <w:szCs w:val="20"/>
-        </w:rPr>
-        <w:t xml:space="preserve">  </w:t>
-      </w:r>
-      <w:r>
-        <w:rPr>
-          <w:b/>
-          <w:bCs/>
-          <w:sz w:val="20"/>
-          <w:szCs w:val="20"/>
-        </w:rPr>
-        <w:t>-</w:t>
-      </w:r>
-      <w:proofErr w:type="gramEnd"/>
-      <w:r>
-        <w:rPr>
-          <w:b/>
-          <w:bCs/>
-          <w:sz w:val="20"/>
-          <w:szCs w:val="20"/>
-        </w:rPr>
-        <w:t>&gt; sub test no. 7</w:t>
-      </w:r>
-    </w:p>
-    <w:p>
-      <w:pPr>
-        <w:spacing w:after="0" w:line="240" w:lineRule="auto"/>
-        <w:rPr>
-          <w:sz w:val="20"/>
-          <w:szCs w:val="20"/>
-        </w:rPr>
-      </w:pPr>
-      <w:r>
-        <w:rPr>
-          <w:sz w:val="20"/>
-          <w:szCs w:val="20"/>
-        </w:rPr>
-        <w:t>header:      Rhine_30min_7</w:t>
-      </w:r>
-    </w:p>
-    <w:p>
-      <w:pPr>
-        <w:spacing w:after="0" w:line="240" w:lineRule="auto"/>
-        <w:rPr>
-          <w:sz w:val="20"/>
-          <w:szCs w:val="20"/>
-        </w:rPr>
-      </w:pPr>
-      <w:r>
-        <w:rPr>
-          <w:sz w:val="20"/>
-          <w:szCs w:val="20"/>
-        </w:rPr>
-        <w:t xml:space="preserve">description: 7th Rhine 30min with </w:t>
-      </w:r>
-      <w:proofErr w:type="spellStart"/>
-      <w:r>
-        <w:rPr>
-          <w:sz w:val="20"/>
-          <w:szCs w:val="20"/>
-        </w:rPr>
-        <w:t>waterdemand</w:t>
-      </w:r>
-      <w:proofErr w:type="spellEnd"/>
-      <w:r>
-        <w:rPr>
-          <w:sz w:val="20"/>
-          <w:szCs w:val="20"/>
-        </w:rPr>
-        <w:t xml:space="preserve"> TRUE</w:t>
-      </w:r>
-    </w:p>
-    <w:p>
-      <w:pPr>
-        <w:spacing w:after="0" w:line="240" w:lineRule="auto"/>
-        <w:rPr>
-          <w:sz w:val="20"/>
-          <w:szCs w:val="20"/>
-        </w:rPr>
-      </w:pPr>
-      <w:proofErr w:type="spellStart"/>
-      <w:r>
-        <w:rPr>
-          <w:sz w:val="20"/>
-          <w:szCs w:val="20"/>
-        </w:rPr>
-        <w:t>set_save</w:t>
-      </w:r>
-      <w:proofErr w:type="spellEnd"/>
-      <w:r>
-        <w:rPr>
-          <w:sz w:val="20"/>
-          <w:szCs w:val="20"/>
-        </w:rPr>
-        <w:t>:    settings_rhine_30min_07.ini</w:t>
-      </w:r>
-    </w:p>
-    <w:p>
-      <w:pPr>
-        <w:spacing w:after="0" w:line="240" w:lineRule="auto"/>
-        <w:rPr>
-          <w:sz w:val="18"/>
-          <w:szCs w:val="18"/>
-        </w:rPr>
-      </w:pPr>
-      <w:r>
-        <w:rPr>
-          <w:sz w:val="20"/>
-          <w:szCs w:val="20"/>
-        </w:rPr>
-        <w:t xml:space="preserve">changes:     </w:t>
-      </w:r>
-      <w:proofErr w:type="spellStart"/>
-      <w:r>
-        <w:rPr>
-          <w:sz w:val="18"/>
-          <w:szCs w:val="18"/>
-        </w:rPr>
-        <w:t>calc_evaporation</w:t>
-      </w:r>
-      <w:proofErr w:type="spellEnd"/>
-      <w:r>
-        <w:rPr>
-          <w:sz w:val="18"/>
-          <w:szCs w:val="18"/>
-        </w:rPr>
-        <w:t xml:space="preserve"> = False; </w:t>
-      </w:r>
-      <w:proofErr w:type="spellStart"/>
-      <w:r>
-        <w:rPr>
-          <w:sz w:val="18"/>
-          <w:szCs w:val="18"/>
-        </w:rPr>
-        <w:t>includeIrrigation</w:t>
-      </w:r>
-      <w:proofErr w:type="spellEnd"/>
-      <w:r>
-        <w:rPr>
-          <w:sz w:val="18"/>
-          <w:szCs w:val="18"/>
-        </w:rPr>
-        <w:t xml:space="preserve"> = True; </w:t>
-      </w:r>
-      <w:proofErr w:type="spellStart"/>
-      <w:r>
-        <w:rPr>
-          <w:sz w:val="18"/>
-          <w:szCs w:val="18"/>
-        </w:rPr>
-        <w:t>preferentialFlow</w:t>
-      </w:r>
-      <w:proofErr w:type="spellEnd"/>
-      <w:r>
-        <w:rPr>
-          <w:sz w:val="18"/>
-          <w:szCs w:val="18"/>
-        </w:rPr>
-        <w:t xml:space="preserve"> = True; </w:t>
-      </w:r>
-      <w:proofErr w:type="spellStart"/>
-      <w:r>
-        <w:rPr>
-          <w:sz w:val="18"/>
-          <w:szCs w:val="18"/>
-        </w:rPr>
-        <w:t>CapillarRise</w:t>
-      </w:r>
-      <w:proofErr w:type="spellEnd"/>
-      <w:r>
-        <w:rPr>
-          <w:sz w:val="18"/>
-          <w:szCs w:val="18"/>
-        </w:rPr>
-        <w:t xml:space="preserve"> = True;</w:t>
-      </w:r>
-      <w:r>
-        <w:rPr>
-          <w:sz w:val="18"/>
-          <w:szCs w:val="18"/>
-        </w:rPr>
-        <w:br/>
-        <w:t xml:space="preserve">                       </w:t>
-      </w:r>
-      <w:proofErr w:type="spellStart"/>
-      <w:r>
-        <w:rPr>
-          <w:sz w:val="18"/>
-          <w:szCs w:val="18"/>
-        </w:rPr>
-        <w:t>includeRunoffConcentration</w:t>
-      </w:r>
-      <w:proofErr w:type="spellEnd"/>
-      <w:r>
-        <w:rPr>
-          <w:sz w:val="18"/>
-          <w:szCs w:val="18"/>
-        </w:rPr>
-        <w:t xml:space="preserve"> = True; </w:t>
-      </w:r>
-      <w:proofErr w:type="spellStart"/>
-      <w:r>
-        <w:rPr>
-          <w:sz w:val="18"/>
-          <w:szCs w:val="18"/>
-        </w:rPr>
-        <w:t>includeWaterBodies</w:t>
-      </w:r>
-      <w:proofErr w:type="spellEnd"/>
-      <w:r>
-        <w:rPr>
-          <w:sz w:val="18"/>
-          <w:szCs w:val="18"/>
-        </w:rPr>
-        <w:t xml:space="preserve"> = True; </w:t>
-      </w:r>
-      <w:proofErr w:type="spellStart"/>
-      <w:r>
-        <w:rPr>
-          <w:sz w:val="18"/>
-          <w:szCs w:val="18"/>
-        </w:rPr>
-        <w:t>includeWaterDemand</w:t>
-      </w:r>
-      <w:proofErr w:type="spellEnd"/>
-      <w:r>
-        <w:rPr>
-          <w:sz w:val="18"/>
-          <w:szCs w:val="18"/>
-        </w:rPr>
-        <w:t xml:space="preserve"> = True; </w:t>
-      </w:r>
-      <w:proofErr w:type="spellStart"/>
-      <w:r>
-        <w:rPr>
-          <w:sz w:val="18"/>
-          <w:szCs w:val="18"/>
-        </w:rPr>
-        <w:t>StepEnd</w:t>
-      </w:r>
-      <w:proofErr w:type="spellEnd"/>
-      <w:r>
-        <w:rPr>
-          <w:sz w:val="18"/>
-          <w:szCs w:val="18"/>
-        </w:rPr>
-        <w:t xml:space="preserve"> = 40</w:t>
-      </w:r>
-    </w:p>
-    <w:p>
-      <w:pPr>
-        <w:spacing w:after="0" w:line="240" w:lineRule="auto"/>
-        <w:rPr>
-          <w:sz w:val="20"/>
-          <w:szCs w:val="20"/>
-        </w:rPr>
-      </w:pPr>
-      <w:r>
-        <w:rPr>
-          <w:sz w:val="20"/>
-          <w:szCs w:val="20"/>
-        </w:rPr>
-        <w:t xml:space="preserve">adds:        </w:t>
-      </w:r>
-      <w:proofErr w:type="spellStart"/>
-      <w:r>
-        <w:rPr>
-          <w:sz w:val="20"/>
-          <w:szCs w:val="20"/>
-        </w:rPr>
-        <w:t>OUT_TSS_Daily</w:t>
-      </w:r>
-      <w:proofErr w:type="spellEnd"/>
-      <w:r>
-        <w:rPr>
-          <w:sz w:val="20"/>
-          <w:szCs w:val="20"/>
-        </w:rPr>
-        <w:t xml:space="preserve"> = discharge</w:t>
-      </w:r>
-    </w:p>
-    <w:p>
-      <w:pPr>
-        <w:spacing w:after="0" w:line="240" w:lineRule="auto"/>
-        <w:rPr>
-          <w:b/>
-          <w:bCs/>
-          <w:sz w:val="20"/>
-          <w:szCs w:val="20"/>
-        </w:rPr>
-      </w:pPr>
-      <w:proofErr w:type="spellStart"/>
-      <w:r>
-        <w:rPr>
-          <w:sz w:val="20"/>
-          <w:szCs w:val="20"/>
-        </w:rPr>
-        <w:t>last_value</w:t>
-      </w:r>
-      <w:proofErr w:type="spellEnd"/>
-      <w:r>
-        <w:rPr>
-          <w:sz w:val="20"/>
-          <w:szCs w:val="20"/>
-        </w:rPr>
-        <w:t>:  443.03</w:t>
-      </w:r>
-      <w:r>
-        <w:rPr>
-          <w:b/>
-          <w:bCs/>
-          <w:sz w:val="20"/>
-          <w:szCs w:val="20"/>
-        </w:rPr>
-        <w:tab/>
-      </w:r>
-    </w:p>
-    <w:p>
-      <w:pPr>
-        <w:spacing w:after="0" w:line="240" w:lineRule="auto"/>
-        <w:rPr>
-          <w:sz w:val="20"/>
-          <w:szCs w:val="20"/>
-        </w:rPr>
-      </w:pPr>
-    </w:p>
-    <w:p>
-      <w:pPr>
-        <w:spacing w:after="0" w:line="240" w:lineRule="auto"/>
-        <w:rPr>
-          <w:sz w:val="20"/>
-          <w:szCs w:val="20"/>
-        </w:rPr>
-      </w:pPr>
-      <w:r>
-        <w:rPr>
-          <w:sz w:val="20"/>
-          <w:szCs w:val="20"/>
-        </w:rPr>
-        <w:t>….</w:t>
-      </w:r>
-    </w:p>
-    <w:p>
-      <w:pPr>
-        <w:spacing w:after="0" w:line="240" w:lineRule="auto"/>
-        <w:rPr>
-          <w:sz w:val="20"/>
-          <w:szCs w:val="20"/>
-        </w:rPr>
-      </w:pPr>
-    </w:p>
-    <w:p>
-      <w:pPr>
-        <w:spacing w:after="0" w:line="240" w:lineRule="auto"/>
-        <w:rPr>
-          <w:sz w:val="20"/>
-          <w:szCs w:val="20"/>
-        </w:rPr>
-      </w:pPr>
-      <w:r>
-        <w:rPr>
-          <w:sz w:val="20"/>
-          <w:szCs w:val="20"/>
-        </w:rPr>
-        <w:t># -----------------------------</w:t>
-      </w:r>
-    </w:p>
-    <w:p>
-      <w:pPr>
-        <w:spacing w:after="0" w:line="240" w:lineRule="auto"/>
-        <w:rPr>
-          <w:sz w:val="20"/>
-          <w:szCs w:val="20"/>
-        </w:rPr>
-      </w:pPr>
-      <w:r>
-        <w:rPr>
-          <w:sz w:val="20"/>
-          <w:szCs w:val="20"/>
-        </w:rPr>
-        <w:t xml:space="preserve">    # </w:t>
-      </w:r>
-      <w:proofErr w:type="gramStart"/>
-      <w:r>
-        <w:rPr>
-          <w:sz w:val="20"/>
-          <w:szCs w:val="20"/>
-        </w:rPr>
-        <w:t>Global</w:t>
-      </w:r>
-      <w:r>
-        <w:rPr>
-          <w:sz w:val="20"/>
-          <w:szCs w:val="20"/>
-        </w:rPr>
-        <w:t xml:space="preserve">  </w:t>
-      </w:r>
-      <w:r>
-        <w:rPr>
-          <w:b/>
-          <w:bCs/>
-          <w:sz w:val="20"/>
-          <w:szCs w:val="20"/>
-        </w:rPr>
-        <w:t>-</w:t>
-      </w:r>
-      <w:proofErr w:type="gramEnd"/>
-      <w:r>
-        <w:rPr>
-          <w:b/>
-          <w:bCs/>
-          <w:sz w:val="20"/>
-          <w:szCs w:val="20"/>
-        </w:rPr>
-        <w:t>&gt; next test</w:t>
+        <w:t>-&gt; next test</w:t>
       </w:r>
     </w:p>
     <w:p>
@@ -3413,21 +3169,12 @@
         <w:t>path_out</w:t>
       </w:r>
       <w:proofErr w:type="spellEnd"/>
-      <w:proofErr w:type="gramStart"/>
-      <w:r>
-        <w:rPr>
-          <w:sz w:val="20"/>
-          <w:szCs w:val="20"/>
-        </w:rPr>
-        <w:t>: .</w:t>
-      </w:r>
-      <w:proofErr w:type="gramEnd"/>
-      <w:r>
-        <w:rPr>
-          <w:sz w:val="20"/>
-          <w:szCs w:val="20"/>
-        </w:rPr>
-        <w:t>/output/global</w:t>
+      <w:r>
+        <w:rPr>
+          <w:sz w:val="20"/>
+          <w:szCs w:val="20"/>
+        </w:rPr>
+        <w:t>: ./output/global</w:t>
       </w:r>
     </w:p>
     <w:p>
@@ -3702,92 +3449,82 @@
           <w:szCs w:val="20"/>
           <w:lang w:val="de-AT"/>
         </w:rPr>
-        <w:t>: Rhine_30</w:t>
-      </w:r>
-      <w:proofErr w:type="gramStart"/>
-      <w:r>
+        <w:t>: Rhine_30min  True</w:t>
+      </w:r>
+    </w:p>
+    <w:p>
+      <w:pPr>
+        <w:spacing w:after="0" w:line="240" w:lineRule="auto"/>
         <w:rPr>
           <w:sz w:val="20"/>
           <w:szCs w:val="20"/>
           <w:lang w:val="de-AT"/>
         </w:rPr>
-        <w:t>min  True</w:t>
-      </w:r>
-      <w:proofErr w:type="gramEnd"/>
-    </w:p>
-    <w:p>
-      <w:pPr>
-        <w:spacing w:after="0" w:line="240" w:lineRule="auto"/>
+      </w:pPr>
+      <w:proofErr w:type="spellStart"/>
+      <w:r>
         <w:rPr>
           <w:sz w:val="20"/>
           <w:szCs w:val="20"/>
           <w:lang w:val="de-AT"/>
         </w:rPr>
-      </w:pPr>
-      <w:proofErr w:type="spellStart"/>
+        <w:t>runtest</w:t>
+      </w:r>
+      <w:proofErr w:type="spellEnd"/>
       <w:r>
         <w:rPr>
           <w:sz w:val="20"/>
           <w:szCs w:val="20"/>
           <w:lang w:val="de-AT"/>
         </w:rPr>
+        <w:t>: global_30min True</w:t>
+      </w:r>
+    </w:p>
+    <w:p>
+      <w:pPr>
+        <w:spacing w:after="0" w:line="240" w:lineRule="auto"/>
+        <w:rPr>
+          <w:sz w:val="20"/>
+          <w:szCs w:val="20"/>
+          <w:lang w:val="de-AT"/>
+        </w:rPr>
+      </w:pPr>
+    </w:p>
+    <w:p>
+      <w:pPr>
+        <w:spacing w:after="0" w:line="240" w:lineRule="auto"/>
+        <w:rPr>
+          <w:sz w:val="16"/>
+          <w:szCs w:val="16"/>
+        </w:rPr>
+      </w:pPr>
+      <w:r>
+        <w:rPr>
+          <w:sz w:val="16"/>
+          <w:szCs w:val="16"/>
+        </w:rPr>
+        <w:t># True is the tests for this section should be done</w:t>
+      </w:r>
+    </w:p>
+    <w:p>
+      <w:pPr>
+        <w:spacing w:after="0" w:line="240" w:lineRule="auto"/>
+        <w:rPr>
+          <w:sz w:val="16"/>
+          <w:szCs w:val="16"/>
+        </w:rPr>
+      </w:pPr>
+      <w:proofErr w:type="spellStart"/>
+      <w:r>
+        <w:rPr>
+          <w:sz w:val="16"/>
+          <w:szCs w:val="16"/>
+        </w:rPr>
         <w:t>runtest</w:t>
       </w:r>
       <w:proofErr w:type="spellEnd"/>
       <w:r>
         <w:rPr>
-          <w:sz w:val="20"/>
-          <w:szCs w:val="20"/>
-          <w:lang w:val="de-AT"/>
-        </w:rPr>
-        <w:t>: global_30min True</w:t>
-      </w:r>
-    </w:p>
-    <w:p>
-      <w:pPr>
-        <w:spacing w:after="0" w:line="240" w:lineRule="auto"/>
-        <w:rPr>
-          <w:sz w:val="20"/>
-          <w:szCs w:val="20"/>
-          <w:lang w:val="de-AT"/>
-        </w:rPr>
-      </w:pPr>
-    </w:p>
-    <w:p>
-      <w:pPr>
-        <w:spacing w:after="0" w:line="240" w:lineRule="auto"/>
-        <w:rPr>
-          <w:sz w:val="16"/>
-          <w:szCs w:val="16"/>
-        </w:rPr>
-      </w:pPr>
-      <w:r>
-        <w:rPr>
-          <w:sz w:val="16"/>
-          <w:szCs w:val="16"/>
-        </w:rPr>
-        <w:t># True is the tests for this section should be done</w:t>
-      </w:r>
-    </w:p>
-    <w:p>
-      <w:pPr>
-        <w:spacing w:after="0" w:line="240" w:lineRule="auto"/>
-        <w:rPr>
-          <w:sz w:val="16"/>
-          <w:szCs w:val="16"/>
-        </w:rPr>
-      </w:pPr>
-      <w:proofErr w:type="spellStart"/>
-      <w:r>
-        <w:rPr>
-          <w:sz w:val="16"/>
-          <w:szCs w:val="16"/>
-        </w:rPr>
-        <w:t>runtest</w:t>
-      </w:r>
-      <w:proofErr w:type="spellEnd"/>
-      <w:r>
-        <w:rPr>
           <w:sz w:val="16"/>
           <w:szCs w:val="16"/>
         </w:rPr>
@@ -3799,15 +3536,7 @@
           <w:sz w:val="16"/>
           <w:szCs w:val="16"/>
         </w:rPr>
-        <w:t>XXXX_</w:t>
-      </w:r>
-      <w:proofErr w:type="gramStart"/>
-      <w:r>
-        <w:rPr>
-          <w:sz w:val="16"/>
-          <w:szCs w:val="16"/>
-        </w:rPr>
-        <w:t>XXmin</w:t>
+        <w:t>XXXX_XXmin</w:t>
       </w:r>
       <w:proofErr w:type="spellEnd"/>
       <w:r>
@@ -3817,7 +3546,6 @@
         </w:rPr>
         <w:t xml:space="preserve">  True</w:t>
       </w:r>
-      <w:proofErr w:type="gramEnd"/>
     </w:p>
     <w:p>
       <w:pPr>
@@ -3917,7 +3645,6 @@
         <w:lastRenderedPageBreak/>
         <w:t xml:space="preserve"># </w:t>
       </w:r>
-      <w:proofErr w:type="gramStart"/>
       <w:r>
         <w:rPr>
           <w:sz w:val="16"/>
@@ -3944,15 +3671,7 @@
           <w:sz w:val="16"/>
           <w:szCs w:val="16"/>
         </w:rPr>
-        <w:t>min</w:t>
-      </w:r>
-      <w:proofErr w:type="gramEnd"/>
-      <w:r>
-        <w:rPr>
-          <w:sz w:val="16"/>
-          <w:szCs w:val="16"/>
-        </w:rPr>
-        <w:t xml:space="preserve"> versions</w:t>
+        <w:t>min versions</w:t>
       </w:r>
     </w:p>
     <w:p>
@@ -4194,21 +3913,12 @@
         <w:t>path_root</w:t>
       </w:r>
       <w:proofErr w:type="spellEnd"/>
-      <w:proofErr w:type="gramStart"/>
-      <w:r>
-        <w:rPr>
-          <w:sz w:val="16"/>
-          <w:szCs w:val="16"/>
-        </w:rPr>
-        <w:t>: .</w:t>
-      </w:r>
-      <w:proofErr w:type="gramEnd"/>
-      <w:r>
-        <w:rPr>
-          <w:sz w:val="16"/>
-          <w:szCs w:val="16"/>
-        </w:rPr>
-        <w:t>/</w:t>
+      <w:r>
+        <w:rPr>
+          <w:sz w:val="16"/>
+          <w:szCs w:val="16"/>
+        </w:rPr>
+        <w:t>: ./</w:t>
       </w:r>
     </w:p>
     <w:p>
@@ -4235,21 +3945,12 @@
         <w:t>path_init</w:t>
       </w:r>
       <w:proofErr w:type="spellEnd"/>
-      <w:proofErr w:type="gramStart"/>
-      <w:r>
-        <w:rPr>
-          <w:sz w:val="16"/>
-          <w:szCs w:val="16"/>
-        </w:rPr>
-        <w:t>: .</w:t>
-      </w:r>
-      <w:proofErr w:type="gramEnd"/>
-      <w:r>
-        <w:rPr>
-          <w:sz w:val="16"/>
-          <w:szCs w:val="16"/>
-        </w:rPr>
-        <w:t>/</w:t>
+      <w:r>
+        <w:rPr>
+          <w:sz w:val="16"/>
+          <w:szCs w:val="16"/>
+        </w:rPr>
+        <w:t>: ./</w:t>
       </w:r>
       <w:proofErr w:type="spellStart"/>
       <w:r>
@@ -4285,21 +3986,12 @@
         <w:t>path_out</w:t>
       </w:r>
       <w:proofErr w:type="spellEnd"/>
-      <w:proofErr w:type="gramStart"/>
-      <w:r>
-        <w:rPr>
-          <w:sz w:val="16"/>
-          <w:szCs w:val="16"/>
-        </w:rPr>
-        <w:t>: .</w:t>
-      </w:r>
-      <w:proofErr w:type="gramEnd"/>
-      <w:r>
-        <w:rPr>
-          <w:sz w:val="16"/>
-          <w:szCs w:val="16"/>
-        </w:rPr>
-        <w:t>/output/</w:t>
+      <w:r>
+        <w:rPr>
+          <w:sz w:val="16"/>
+          <w:szCs w:val="16"/>
+        </w:rPr>
+        <w:t>: ./output/</w:t>
       </w:r>
       <w:r>
         <w:rPr>
@@ -5023,23 +4715,7 @@
           <w:sz w:val="20"/>
           <w:szCs w:val="20"/>
         </w:rPr>
-        <w:t xml:space="preserve">Or you add the tests to an </w:t>
-      </w:r>
-      <w:proofErr w:type="gramStart"/>
-      <w:r>
-        <w:rPr>
-          <w:sz w:val="20"/>
-          <w:szCs w:val="20"/>
-        </w:rPr>
-        <w:t>existing ones</w:t>
-      </w:r>
-      <w:proofErr w:type="gramEnd"/>
-      <w:r>
-        <w:rPr>
-          <w:sz w:val="20"/>
-          <w:szCs w:val="20"/>
-        </w:rPr>
-        <w:t>:</w:t>
+        <w:t>Or you add the tests to an existing ones:</w:t>
       </w:r>
     </w:p>
     <w:p>
@@ -5084,31 +4760,15 @@
           <w:sz w:val="16"/>
           <w:szCs w:val="16"/>
         </w:rPr>
-        <w:t>XXXX_</w:t>
-      </w:r>
-      <w:proofErr w:type="gramStart"/>
-      <w:r>
-        <w:rPr>
-          <w:sz w:val="16"/>
-          <w:szCs w:val="16"/>
-        </w:rPr>
-        <w:t>XXmin</w:t>
-      </w:r>
-      <w:proofErr w:type="spellEnd"/>
-      <w:r>
-        <w:rPr>
-          <w:sz w:val="16"/>
-          <w:szCs w:val="16"/>
-        </w:rPr>
-        <w:t xml:space="preserve">  True</w:t>
-      </w:r>
-      <w:proofErr w:type="gramEnd"/>
-      <w:r>
-        <w:rPr>
-          <w:sz w:val="16"/>
-          <w:szCs w:val="16"/>
-        </w:rPr>
-        <w:t xml:space="preserve"> below the existing </w:t>
+        <w:t>XXXX_XXmin</w:t>
+      </w:r>
+      <w:proofErr w:type="spellEnd"/>
+      <w:r>
+        <w:rPr>
+          <w:sz w:val="16"/>
+          <w:szCs w:val="16"/>
+        </w:rPr>
+        <w:t xml:space="preserve">  True below the existing </w:t>
       </w:r>
       <w:proofErr w:type="spellStart"/>
       <w:r>
@@ -5921,7 +5581,7 @@
 </file>
 
 <file path=word/numbering.xml><?xml version="1.0" encoding="utf-8"?>
-<w:numbering xmlns:wpc="http://schemas.microsoft.com/office/word/2010/wordprocessingCanvas" xmlns:cx="http://schemas.microsoft.com/office/drawing/2014/chartex" xmlns:cx1="http://schemas.microsoft.com/office/drawing/2015/9/8/chartex" xmlns:cx2="http://schemas.microsoft.com/office/drawing/2015/10/21/chartex" xmlns:cx3="http://schemas.microsoft.com/office/drawing/2016/5/9/chartex" xmlns:cx4="http://schemas.microsoft.com/office/drawing/2016/5/10/chartex" xmlns:cx5="http://schemas.microsoft.com/office/drawing/2016/5/11/chartex" xmlns:cx6="http://schemas.microsoft.com/office/drawing/2016/5/12/chartex" xmlns:cx7="http://schemas.microsoft.com/office/drawing/2016/5/13/chartex" xmlns:cx8="http://schemas.microsoft.com/office/drawing/2016/5/14/chartex" xmlns:mc="http://schemas.openxmlformats.org/markup-compatibility/2006" xmlns:aink="http://schemas.microsoft.com/office/drawing/2016/ink" xmlns:am3d="http://schemas.microsoft.com/office/drawing/2017/model3d" xmlns:o="urn:schemas-microsoft-com:office:office" xmlns:r="http://schemas.openxmlformats.org/officeDocument/2006/relationships" xmlns:m="http://schemas.openxmlformats.org/officeDocument/2006/math" xmlns:v="urn:schemas-microsoft-com:vml" xmlns:wp14="http://schemas.microsoft.com/office/word/2010/wordprocessingDrawing" xmlns:wp="http://schemas.openxmlformats.org/drawingml/2006/wordprocessingDrawing" xmlns:w10="urn:schemas-microsoft-com:office:word" xmlns:w="http://schemas.openxmlformats.org/wordprocessingml/2006/main" xmlns:w14="http://schemas.microsoft.com/office/word/2010/wordml" xmlns:w15="http://schemas.microsoft.com/office/word/2012/wordml" xmlns:w16cex="http://schemas.microsoft.com/office/word/2018/wordml/cex" xmlns:w16cid="http://schemas.microsoft.com/office/word/2016/wordml/cid" xmlns:w16="http://schemas.microsoft.com/office/word/2018/wordml" xmlns:w16sdtdh="http://schemas.microsoft.com/office/word/2020/wordml/sdtdatahash" xmlns:w16se="http://schemas.microsoft.com/office/word/2015/wordml/symex" xmlns:wpg="http://schemas.microsoft.com/office/word/2010/wordprocessingGroup" xmlns:wpi="http://schemas.microsoft.com/office/word/2010/wordprocessingInk" xmlns:wne="http://schemas.microsoft.com/office/word/2006/wordml" xmlns:wps="http://schemas.microsoft.com/office/word/2010/wordprocessingShape" mc:Ignorable="w14 w15 w16se w16cid w16 w16cex w16sdtdh wp14">
+<w:numbering xmlns:wpc="http://schemas.microsoft.com/office/word/2010/wordprocessingCanvas" xmlns:cx="http://schemas.microsoft.com/office/drawing/2014/chartex" xmlns:cx1="http://schemas.microsoft.com/office/drawing/2015/9/8/chartex" xmlns:cx2="http://schemas.microsoft.com/office/drawing/2015/10/21/chartex" xmlns:cx3="http://schemas.microsoft.com/office/drawing/2016/5/9/chartex" xmlns:cx4="http://schemas.microsoft.com/office/drawing/2016/5/10/chartex" xmlns:cx5="http://schemas.microsoft.com/office/drawing/2016/5/11/chartex" xmlns:cx6="http://schemas.microsoft.com/office/drawing/2016/5/12/chartex" xmlns:cx7="http://schemas.microsoft.com/office/drawing/2016/5/13/chartex" xmlns:cx8="http://schemas.microsoft.com/office/drawing/2016/5/14/chartex" xmlns:mc="http://schemas.openxmlformats.org/markup-compatibility/2006" xmlns:aink="http://schemas.microsoft.com/office/drawing/2016/ink" xmlns:am3d="http://schemas.microsoft.com/office/drawing/2017/model3d" xmlns:o="urn:schemas-microsoft-com:office:office" xmlns:oel="http://schemas.microsoft.com/office/2019/extlst" xmlns:r="http://schemas.openxmlformats.org/officeDocument/2006/relationships" xmlns:m="http://schemas.openxmlformats.org/officeDocument/2006/math" xmlns:v="urn:schemas-microsoft-com:vml" xmlns:wp14="http://schemas.microsoft.com/office/word/2010/wordprocessingDrawing" xmlns:wp="http://schemas.openxmlformats.org/drawingml/2006/wordprocessingDrawing" xmlns:w10="urn:schemas-microsoft-com:office:word" xmlns:w="http://schemas.openxmlformats.org/wordprocessingml/2006/main" xmlns:w14="http://schemas.microsoft.com/office/word/2010/wordml" xmlns:w15="http://schemas.microsoft.com/office/word/2012/wordml" xmlns:w16cex="http://schemas.microsoft.com/office/word/2018/wordml/cex" xmlns:w16cid="http://schemas.microsoft.com/office/word/2016/wordml/cid" xmlns:w16="http://schemas.microsoft.com/office/word/2018/wordml" xmlns:w16du="http://schemas.microsoft.com/office/word/2023/wordml/word16du" xmlns:w16sdtdh="http://schemas.microsoft.com/office/word/2020/wordml/sdtdatahash" xmlns:w16sdtfl="http://schemas.microsoft.com/office/word/2024/wordml/sdtformatlock" xmlns:w16se="http://schemas.microsoft.com/office/word/2015/wordml/symex" xmlns:wpg="http://schemas.microsoft.com/office/word/2010/wordprocessingGroup" xmlns:wpi="http://schemas.microsoft.com/office/word/2010/wordprocessingInk" xmlns:wne="http://schemas.microsoft.com/office/word/2006/wordml" xmlns:wps="http://schemas.microsoft.com/office/word/2010/wordprocessingShape" mc:Ignorable="w14 w15 w16se w16cid w16 w16cex w16sdtdh w16sdtfl w16du wp14">
   <w:abstractNum w:abstractNumId="0" w15:restartNumberingAfterBreak="0">
     <w:nsid w:val="044E5402"/>
     <w:multiLevelType w:val="hybridMultilevel"/>
@@ -6553,29 +6213,29 @@
       </w:rPr>
     </w:lvl>
   </w:abstractNum>
-  <w:num w:numId="1">
+  <w:num w:numId="1" w16cid:durableId="1266305934">
     <w:abstractNumId w:val="4"/>
   </w:num>
-  <w:num w:numId="2">
+  <w:num w:numId="2" w16cid:durableId="1003435670">
     <w:abstractNumId w:val="3"/>
   </w:num>
-  <w:num w:numId="3">
+  <w:num w:numId="3" w16cid:durableId="514458872">
     <w:abstractNumId w:val="0"/>
   </w:num>
-  <w:num w:numId="4">
+  <w:num w:numId="4" w16cid:durableId="1559785548">
     <w:abstractNumId w:val="5"/>
   </w:num>
-  <w:num w:numId="5">
+  <w:num w:numId="5" w16cid:durableId="47412931">
     <w:abstractNumId w:val="1"/>
   </w:num>
-  <w:num w:numId="6">
+  <w:num w:numId="6" w16cid:durableId="1304433388">
     <w:abstractNumId w:val="2"/>
   </w:num>
 </w:numbering>
 </file>
 
 <file path=word/styles.xml><?xml version="1.0" encoding="utf-8"?>
-<w:styles xmlns:mc="http://schemas.openxmlformats.org/markup-compatibility/2006" xmlns:r="http://schemas.openxmlformats.org/officeDocument/2006/relationships" xmlns:w="http://schemas.openxmlformats.org/wordprocessingml/2006/main" xmlns:w14="http://schemas.microsoft.com/office/word/2010/wordml" xmlns:w15="http://schemas.microsoft.com/office/word/2012/wordml" xmlns:w16cex="http://schemas.microsoft.com/office/word/2018/wordml/cex" xmlns:w16cid="http://schemas.microsoft.com/office/word/2016/wordml/cid" xmlns:w16="http://schemas.microsoft.com/office/word/2018/wordml" xmlns:w16sdtdh="http://schemas.microsoft.com/office/word/2020/wordml/sdtdatahash" xmlns:w16se="http://schemas.microsoft.com/office/word/2015/wordml/symex" mc:Ignorable="w14 w15 w16se w16cid w16 w16cex w16sdtdh">
+<w:styles xmlns:mc="http://schemas.openxmlformats.org/markup-compatibility/2006" xmlns:r="http://schemas.openxmlformats.org/officeDocument/2006/relationships" xmlns:w="http://schemas.openxmlformats.org/wordprocessingml/2006/main" xmlns:w14="http://schemas.microsoft.com/office/word/2010/wordml" xmlns:w15="http://schemas.microsoft.com/office/word/2012/wordml" xmlns:w16cex="http://schemas.microsoft.com/office/word/2018/wordml/cex" xmlns:w16cid="http://schemas.microsoft.com/office/word/2016/wordml/cid" xmlns:w16="http://schemas.microsoft.com/office/word/2018/wordml" xmlns:w16du="http://schemas.microsoft.com/office/word/2023/wordml/word16du" xmlns:w16sdtdh="http://schemas.microsoft.com/office/word/2020/wordml/sdtdatahash" xmlns:w16sdtfl="http://schemas.microsoft.com/office/word/2024/wordml/sdtformatlock" xmlns:w16se="http://schemas.microsoft.com/office/word/2015/wordml/symex" mc:Ignorable="w14 w15 w16se w16cid w16 w16cex w16sdtdh w16sdtfl w16du">
   <w:docDefaults>
     <w:rPrDefault>
       <w:rPr>

</xml_diff>